<commit_message>
ulepszenie wszystkiego i synchronizacja dalsza
</commit_message>
<xml_diff>
--- a/OPIS METODY OBLICZANIA KĄTOW.docx
+++ b/OPIS METODY OBLICZANIA KĄTOW.docx
@@ -10,7 +10,7 @@
     <w:p>
       <w:r>
         <w:pict w14:anchorId="741DF59C">
-          <v:rect id="_x0000_i1241" style="width:0;height:1.5pt" o:hralign="center" o:hrstd="t" o:hr="t" fillcolor="#a0a0a0" stroked="f"/>
+          <v:rect id="_x0000_i1025" style="width:0;height:1.5pt" o:hralign="center" o:hrstd="t" o:hr="t" fillcolor="#a0a0a0" stroked="f"/>
         </w:pict>
       </w:r>
     </w:p>
@@ -75,7 +75,7 @@
     <w:p>
       <w:r>
         <w:pict w14:anchorId="3C644E3E">
-          <v:rect id="_x0000_i1242" style="width:0;height:1.5pt" o:hralign="center" o:hrstd="t" o:hr="t" fillcolor="#a0a0a0" stroked="f"/>
+          <v:rect id="_x0000_i1026" style="width:0;height:1.5pt" o:hralign="center" o:hrstd="t" o:hr="t" fillcolor="#a0a0a0" stroked="f"/>
         </w:pict>
       </w:r>
     </w:p>
@@ -216,7 +216,7 @@
     <w:p>
       <w:r>
         <w:pict w14:anchorId="6F1A8201">
-          <v:rect id="_x0000_i1243" style="width:0;height:1.5pt" o:hralign="center" o:hrstd="t" o:hr="t" fillcolor="#a0a0a0" stroked="f"/>
+          <v:rect id="_x0000_i1027" style="width:0;height:1.5pt" o:hralign="center" o:hrstd="t" o:hr="t" fillcolor="#a0a0a0" stroked="f"/>
         </w:pict>
       </w:r>
     </w:p>
@@ -273,7 +273,7 @@
     <w:p>
       <w:r>
         <w:pict w14:anchorId="66FA4644">
-          <v:rect id="_x0000_i1244" style="width:0;height:1.5pt" o:hralign="center" o:hrstd="t" o:hr="t" fillcolor="#a0a0a0" stroked="f"/>
+          <v:rect id="_x0000_i1028" style="width:0;height:1.5pt" o:hralign="center" o:hrstd="t" o:hr="t" fillcolor="#a0a0a0" stroked="f"/>
         </w:pict>
       </w:r>
     </w:p>
@@ -426,7 +426,7 @@
     <w:p>
       <w:r>
         <w:pict w14:anchorId="2A6679BE">
-          <v:rect id="_x0000_i1245" style="width:0;height:1.5pt" o:hralign="center" o:hrstd="t" o:hr="t" fillcolor="#a0a0a0" stroked="f"/>
+          <v:rect id="_x0000_i1029" style="width:0;height:1.5pt" o:hralign="center" o:hrstd="t" o:hr="t" fillcolor="#a0a0a0" stroked="f"/>
         </w:pict>
       </w:r>
     </w:p>
@@ -493,7 +493,7 @@
     <w:p>
       <w:r>
         <w:pict w14:anchorId="38593C19">
-          <v:rect id="_x0000_i1246" style="width:0;height:1.5pt" o:hralign="center" o:hrstd="t" o:hr="t" fillcolor="#a0a0a0" stroked="f"/>
+          <v:rect id="_x0000_i1030" style="width:0;height:1.5pt" o:hralign="center" o:hrstd="t" o:hr="t" fillcolor="#a0a0a0" stroked="f"/>
         </w:pict>
       </w:r>
     </w:p>
@@ -523,6 +523,9 @@
             <m:t>theta_thigh</m:t>
           </m:r>
           <m:r>
+            <m:rPr>
+              <m:sty m:val="p"/>
+            </m:rPr>
             <w:rPr>
               <w:rFonts w:ascii="Cambria Math" w:hAnsi="Cambria Math"/>
             </w:rPr>
@@ -554,6 +557,9 @@
             <m:t>v_thigh = [sin(theta_thigh), cos(theta_thigh)]</m:t>
           </m:r>
           <m:r>
+            <m:rPr>
+              <m:sty m:val="p"/>
+            </m:rPr>
             <w:rPr>
               <w:rFonts w:ascii="Cambria Math" w:hAnsi="Cambria Math"/>
             </w:rPr>
@@ -677,7 +683,7 @@
     <w:p>
       <w:r>
         <w:pict w14:anchorId="52636F43">
-          <v:rect id="_x0000_i1247" style="width:0;height:1.5pt" o:hralign="center" o:hrstd="t" o:hr="t" fillcolor="#a0a0a0" stroked="f"/>
+          <v:rect id="_x0000_i1031" style="width:0;height:1.5pt" o:hralign="center" o:hrstd="t" o:hr="t" fillcolor="#a0a0a0" stroked="f"/>
         </w:pict>
       </w:r>
     </w:p>
@@ -693,13 +699,8 @@
       </w:r>
     </w:p>
     <w:p>
-      <w:proofErr w:type="spellStart"/>
-      <w:r>
-        <w:t>MediaPipe</w:t>
-      </w:r>
-      <w:proofErr w:type="spellEnd"/>
-      <w:r>
-        <w:t xml:space="preserve"> dostarcza współrzędne punktów:</w:t>
+      <w:r>
+        <w:t>MediaPipe dostarcza współrzędne punktów:</w:t>
       </w:r>
     </w:p>
     <w:p>
@@ -718,6 +719,9 @@
             <m:t>hip = (x1, y1)</m:t>
           </m:r>
           <m:r>
+            <m:rPr>
+              <m:sty m:val="p"/>
+            </m:rPr>
             <w:rPr>
               <w:rFonts w:ascii="Cambria Math" w:hAnsi="Cambria Math"/>
               <w:lang w:val="es-ES"/>
@@ -734,6 +738,9 @@
             <m:t>knee = (x2, y2)</m:t>
           </m:r>
           <m:r>
+            <m:rPr>
+              <m:sty m:val="p"/>
+            </m:rPr>
             <w:rPr>
               <w:rFonts w:ascii="Cambria Math" w:hAnsi="Cambria Math"/>
               <w:lang w:val="es-ES"/>
@@ -768,6 +775,9 @@
             <m:t>u = hip - knee</m:t>
           </m:r>
           <m:r>
+            <m:rPr>
+              <m:sty m:val="p"/>
+            </m:rPr>
             <w:rPr>
               <w:rFonts w:ascii="Cambria Math" w:hAnsi="Cambria Math"/>
             </w:rPr>
@@ -814,7 +824,7 @@
     <w:p>
       <w:r>
         <w:pict w14:anchorId="4BB0318F">
-          <v:rect id="_x0000_i1248" style="width:0;height:1.5pt" o:hralign="center" o:hrstd="t" o:hr="t" fillcolor="#a0a0a0" stroked="f"/>
+          <v:rect id="_x0000_i1032" style="width:0;height:1.5pt" o:hralign="center" o:hrstd="t" o:hr="t" fillcolor="#a0a0a0" stroked="f"/>
         </w:pict>
       </w:r>
     </w:p>
@@ -854,29 +864,21 @@
     <w:p>
       <w:r>
         <w:pict w14:anchorId="416A1B15">
-          <v:rect id="_x0000_i1249" style="width:0;height:1.5pt" o:hralign="center" o:hrstd="t" o:hr="t" fillcolor="#a0a0a0" stroked="f"/>
+          <v:rect id="_x0000_i1033" style="width:0;height:1.5pt" o:hralign="center" o:hrstd="t" o:hr="t" fillcolor="#a0a0a0" stroked="f"/>
         </w:pict>
       </w:r>
     </w:p>
     <w:p>
-      <w:r>
-        <w:t xml:space="preserve">B) RMS (Root </w:t>
-      </w:r>
-      <w:proofErr w:type="spellStart"/>
-      <w:r>
-        <w:t>Mean</w:t>
-      </w:r>
-      <w:proofErr w:type="spellEnd"/>
-      <w:r>
-        <w:t xml:space="preserve"> </w:t>
-      </w:r>
-      <w:proofErr w:type="spellStart"/>
-      <w:r>
-        <w:t>Square</w:t>
-      </w:r>
-      <w:proofErr w:type="spellEnd"/>
-      <w:r>
-        <w:t>)</w:t>
+      <w:pPr>
+        <w:rPr>
+          <w:lang w:val="en-US"/>
+        </w:rPr>
+      </w:pPr>
+      <w:r>
+        <w:rPr>
+          <w:lang w:val="en-US"/>
+        </w:rPr>
+        <w:t>B) RMS (Root Mean Square)</w:t>
       </w:r>
     </w:p>
     <w:p>
@@ -922,7 +924,7 @@
     <w:p>
       <w:r>
         <w:pict w14:anchorId="1E9DD032">
-          <v:rect id="_x0000_i1250" style="width:0;height:1.5pt" o:hralign="center" o:hrstd="t" o:hr="t" fillcolor="#a0a0a0" stroked="f"/>
+          <v:rect id="_x0000_i1034" style="width:0;height:1.5pt" o:hralign="center" o:hrstd="t" o:hr="t" fillcolor="#a0a0a0" stroked="f"/>
         </w:pict>
       </w:r>
     </w:p>
@@ -983,7 +985,7 @@
     <w:p>
       <w:r>
         <w:pict w14:anchorId="2748C04B">
-          <v:rect id="_x0000_i1251" style="width:0;height:1.5pt" o:hralign="center" o:hrstd="t" o:hr="t" fillcolor="#a0a0a0" stroked="f"/>
+          <v:rect id="_x0000_i1035" style="width:0;height:1.5pt" o:hralign="center" o:hrstd="t" o:hr="t" fillcolor="#a0a0a0" stroked="f"/>
         </w:pict>
       </w:r>
     </w:p>
@@ -1057,7 +1059,7 @@
     <w:p>
       <w:r>
         <w:pict w14:anchorId="2D05C494">
-          <v:rect id="_x0000_i1252" style="width:0;height:1.5pt" o:hralign="center" o:hrstd="t" o:hr="t" fillcolor="#a0a0a0" stroked="f"/>
+          <v:rect id="_x0000_i1036" style="width:0;height:1.5pt" o:hralign="center" o:hrstd="t" o:hr="t" fillcolor="#a0a0a0" stroked="f"/>
         </w:pict>
       </w:r>
     </w:p>
@@ -4073,6 +4075,7 @@
   <w:style w:type="character" w:default="1" w:styleId="Domylnaczcionkaakapitu">
     <w:name w:val="Default Paragraph Font"/>
     <w:uiPriority w:val="1"/>
+    <w:semiHidden/>
     <w:unhideWhenUsed/>
   </w:style>
   <w:style w:type="table" w:default="1" w:styleId="Standardowy">

</xml_diff>